<commit_message>
additional poa template formatting tweaks
</commit_message>
<xml_diff>
--- a/docassemble/PowerOfAttorneyHealthCare/data/templates/poa_health_care_bilingual.docx
+++ b/docassemble/PowerOfAttorneyHealthCare/data/templates/poa_health_care_bilingual.docx
@@ -485,51 +485,16 @@
                 <w:szCs w:val="24"/>
               </w:rPr>
               <w:lastRenderedPageBreak/>
-              <w:t xml:space="preserve">It is important to put your choice of agent in writing. The written </w:t>
-            </w:r>
-          </w:p>
-          <w:p>
-            <w:pPr>
-              <w:rPr>
-                <w:rFonts w:ascii="Verdana" w:eastAsia="Verdana" w:hAnsi="Verdana" w:cs="Verdana"/>
-                <w:sz w:val="24"/>
-                <w:szCs w:val="24"/>
-              </w:rPr>
-            </w:pPr>
-            <w:r>
-              <w:rPr>
-                <w:rFonts w:ascii="Verdana" w:eastAsia="Verdana" w:hAnsi="Verdana" w:cs="Verdana"/>
-                <w:sz w:val="24"/>
-                <w:szCs w:val="24"/>
-              </w:rPr>
-              <w:t xml:space="preserve">form is often called an "advance directive." You may use this form </w:t>
-            </w:r>
-          </w:p>
-          <w:p>
-            <w:pPr>
-              <w:rPr>
-                <w:rFonts w:ascii="Verdana" w:eastAsia="Verdana" w:hAnsi="Verdana" w:cs="Verdana"/>
-                <w:sz w:val="24"/>
-                <w:szCs w:val="24"/>
-              </w:rPr>
-            </w:pPr>
-            <w:r>
-              <w:rPr>
-                <w:rFonts w:ascii="Verdana" w:eastAsia="Verdana" w:hAnsi="Verdana" w:cs="Verdana"/>
-                <w:sz w:val="24"/>
-                <w:szCs w:val="24"/>
-              </w:rPr>
-              <w:t>or another form, as long as it</w:t>
-            </w:r>
-          </w:p>
-          <w:p>
-            <w:pPr>
-              <w:rPr>
-                <w:rFonts w:ascii="Verdana" w:eastAsia="Verdana" w:hAnsi="Verdana" w:cs="Verdana"/>
-                <w:sz w:val="24"/>
-                <w:szCs w:val="24"/>
-              </w:rPr>
-            </w:pPr>
+              <w:t>It is important to put your choice of agent in writing. The written form is often called an "advance directive." You may use this form or another form, as long as it</w:t>
+            </w:r>
+            <w:r>
+              <w:rPr>
+                <w:rFonts w:ascii="Verdana" w:eastAsia="Verdana" w:hAnsi="Verdana" w:cs="Verdana"/>
+                <w:sz w:val="24"/>
+                <w:szCs w:val="24"/>
+              </w:rPr>
+              <w:t xml:space="preserve"> </w:t>
+            </w:r>
             <w:r>
               <w:rPr>
                 <w:rFonts w:ascii="Verdana" w:eastAsia="Verdana" w:hAnsi="Verdana" w:cs="Verdana"/>
@@ -538,15 +503,14 @@
               </w:rPr>
               <w:t>meets the legal requirements of</w:t>
             </w:r>
-          </w:p>
-          <w:p>
-            <w:pPr>
-              <w:rPr>
-                <w:rFonts w:ascii="Verdana" w:eastAsia="Verdana" w:hAnsi="Verdana" w:cs="Verdana"/>
-                <w:sz w:val="24"/>
-                <w:szCs w:val="24"/>
-              </w:rPr>
-            </w:pPr>
+            <w:r>
+              <w:rPr>
+                <w:rFonts w:ascii="Verdana" w:eastAsia="Verdana" w:hAnsi="Verdana" w:cs="Verdana"/>
+                <w:sz w:val="24"/>
+                <w:szCs w:val="24"/>
+              </w:rPr>
+              <w:t xml:space="preserve"> </w:t>
+            </w:r>
             <w:r>
               <w:rPr>
                 <w:rFonts w:ascii="Verdana" w:eastAsia="Verdana" w:hAnsi="Verdana" w:cs="Verdana"/>
@@ -555,15 +519,14 @@
               </w:rPr>
               <w:t xml:space="preserve">Illinois. There are many written and online resources to guide you and your loved ones in having a conversation about these issues. </w:t>
             </w:r>
-          </w:p>
-          <w:p>
-            <w:pPr>
-              <w:rPr>
-                <w:rFonts w:ascii="Verdana" w:eastAsia="Verdana" w:hAnsi="Verdana" w:cs="Verdana"/>
-                <w:sz w:val="24"/>
-                <w:szCs w:val="24"/>
-              </w:rPr>
-            </w:pPr>
+            <w:r>
+              <w:rPr>
+                <w:rFonts w:ascii="Verdana" w:eastAsia="Verdana" w:hAnsi="Verdana" w:cs="Verdana"/>
+                <w:sz w:val="24"/>
+                <w:szCs w:val="24"/>
+              </w:rPr>
+              <w:t xml:space="preserve"> </w:t>
+            </w:r>
             <w:r>
               <w:rPr>
                 <w:rFonts w:ascii="Verdana" w:eastAsia="Verdana" w:hAnsi="Verdana" w:cs="Verdana"/>
@@ -743,73 +706,21 @@
               <w:lastRenderedPageBreak/>
               <w:t>care interventions or withdraw treatment. Your agent</w:t>
             </w:r>
-          </w:p>
-          <w:p>
-            <w:pPr>
-              <w:rPr>
-                <w:rFonts w:ascii="Verdana" w:eastAsia="Verdana" w:hAnsi="Verdana" w:cs="Verdana"/>
-                <w:sz w:val="24"/>
-                <w:szCs w:val="24"/>
-              </w:rPr>
-            </w:pPr>
-            <w:r>
-              <w:rPr>
-                <w:rFonts w:ascii="Verdana" w:eastAsia="Verdana" w:hAnsi="Verdana" w:cs="Verdana"/>
-                <w:sz w:val="24"/>
-                <w:szCs w:val="24"/>
-              </w:rPr>
-              <w:t xml:space="preserve">will need to think about conversations you have had, your personality, and how you handled important health care issues in the </w:t>
-            </w:r>
-          </w:p>
-          <w:p>
-            <w:pPr>
-              <w:rPr>
-                <w:rFonts w:ascii="Verdana" w:eastAsia="Verdana" w:hAnsi="Verdana" w:cs="Verdana"/>
-                <w:sz w:val="24"/>
-                <w:szCs w:val="24"/>
-              </w:rPr>
-            </w:pPr>
-            <w:r>
-              <w:rPr>
-                <w:rFonts w:ascii="Verdana" w:eastAsia="Verdana" w:hAnsi="Verdana" w:cs="Verdana"/>
-                <w:sz w:val="24"/>
-                <w:szCs w:val="24"/>
-              </w:rPr>
-              <w:t xml:space="preserve">past. Therefore, it is important to </w:t>
-            </w:r>
-          </w:p>
-          <w:p>
-            <w:pPr>
-              <w:rPr>
-                <w:rFonts w:ascii="Verdana" w:eastAsia="Verdana" w:hAnsi="Verdana" w:cs="Verdana"/>
-                <w:sz w:val="24"/>
-                <w:szCs w:val="24"/>
-              </w:rPr>
-            </w:pPr>
-            <w:r>
-              <w:rPr>
-                <w:rFonts w:ascii="Verdana" w:eastAsia="Verdana" w:hAnsi="Verdana" w:cs="Verdana"/>
-                <w:sz w:val="24"/>
-                <w:szCs w:val="24"/>
-              </w:rPr>
-              <w:t xml:space="preserve">talk with your agent and your </w:t>
-            </w:r>
-          </w:p>
-          <w:p>
-            <w:pPr>
-              <w:rPr>
-                <w:rFonts w:ascii="Verdana" w:eastAsia="Verdana" w:hAnsi="Verdana" w:cs="Verdana"/>
-                <w:sz w:val="24"/>
-                <w:szCs w:val="24"/>
-              </w:rPr>
-            </w:pPr>
-            <w:r>
-              <w:rPr>
-                <w:rFonts w:ascii="Verdana" w:eastAsia="Verdana" w:hAnsi="Verdana" w:cs="Verdana"/>
-                <w:sz w:val="24"/>
-                <w:szCs w:val="24"/>
-              </w:rPr>
-              <w:t>family about such things as:</w:t>
+            <w:r>
+              <w:rPr>
+                <w:rFonts w:ascii="Verdana" w:eastAsia="Verdana" w:hAnsi="Verdana" w:cs="Verdana"/>
+                <w:sz w:val="24"/>
+                <w:szCs w:val="24"/>
+              </w:rPr>
+              <w:t xml:space="preserve"> </w:t>
+            </w:r>
+            <w:r>
+              <w:rPr>
+                <w:rFonts w:ascii="Verdana" w:eastAsia="Verdana" w:hAnsi="Verdana" w:cs="Verdana"/>
+                <w:sz w:val="24"/>
+                <w:szCs w:val="24"/>
+              </w:rPr>
+              <w:t>will need to think about conversations you have had, your personality, and how you handled important health care issues in the past. Therefore, it is important to talk with your agent and your family about such things as:</w:t>
             </w:r>
           </w:p>
         </w:tc>
@@ -1303,24 +1214,7 @@
                 <w:szCs w:val="24"/>
               </w:rPr>
               <w:lastRenderedPageBreak/>
-              <w:t xml:space="preserve">(vii) Do you have an existing advance directive, such as a living will, that contains your specific wishes about health care that is </w:t>
-            </w:r>
-          </w:p>
-          <w:p>
-            <w:pPr>
-              <w:rPr>
-                <w:rFonts w:ascii="Verdana" w:eastAsia="Verdana" w:hAnsi="Verdana" w:cs="Verdana"/>
-                <w:sz w:val="24"/>
-                <w:szCs w:val="24"/>
-              </w:rPr>
-            </w:pPr>
-            <w:r>
-              <w:rPr>
-                <w:rFonts w:ascii="Verdana" w:eastAsia="Verdana" w:hAnsi="Verdana" w:cs="Verdana"/>
-                <w:sz w:val="24"/>
-                <w:szCs w:val="24"/>
-              </w:rPr>
-              <w:t xml:space="preserve">only delaying your death? If you have another advance directive, make sure to discuss with your agent the directive and the treatment decisions contained within that outline your preferences. Make sure that your agent agrees to honor the wishes expressed in your advance directive. </w:t>
+              <w:t xml:space="preserve">(vii) Do you have an existing advance directive, such as a living will, that contains your specific wishes about health care that is only delaying your death? If you have another advance directive, make sure to discuss with your agent the directive and the treatment decisions contained within that outline your preferences. Make sure that your agent agrees to honor the wishes expressed in your advance directive. </w:t>
             </w:r>
           </w:p>
         </w:tc>
@@ -1338,6 +1232,8 @@
             <w:pPr>
               <w:rPr>
                 <w:rFonts w:ascii="Verdana" w:eastAsia="Verdana" w:hAnsi="Verdana" w:cs="Verdana"/>
+                <w:i/>
+                <w:iCs/>
                 <w:sz w:val="24"/>
                 <w:szCs w:val="24"/>
               </w:rPr>
@@ -1370,17 +1266,16 @@
               </w:rPr>
               <w:t>¿Tiene alguna directiva anticipada, como un testamento vital, que contenga sus deseos específicos sobre la atención</w:t>
             </w:r>
-          </w:p>
-          <w:p>
-            <w:pPr>
-              <w:rPr>
-                <w:rFonts w:ascii="Verdana" w:eastAsia="Verdana" w:hAnsi="Verdana" w:cs="Verdana"/>
-                <w:i/>
-                <w:iCs/>
-                <w:sz w:val="24"/>
-                <w:szCs w:val="24"/>
-              </w:rPr>
-            </w:pPr>
+            <w:r>
+              <w:rPr>
+                <w:rFonts w:ascii="Verdana" w:eastAsia="Verdana" w:hAnsi="Verdana" w:cs="Verdana"/>
+                <w:i/>
+                <w:iCs/>
+                <w:sz w:val="24"/>
+                <w:szCs w:val="24"/>
+              </w:rPr>
+              <w:t xml:space="preserve"> </w:t>
+            </w:r>
             <w:r>
               <w:rPr>
                 <w:rFonts w:ascii="Verdana" w:eastAsia="Verdana" w:hAnsi="Verdana" w:cs="Verdana"/>
@@ -1948,8 +1843,6 @@
             <w:pPr>
               <w:rPr>
                 <w:rFonts w:ascii="Verdana" w:eastAsia="Verdana" w:hAnsi="Verdana" w:cs="Verdana"/>
-                <w:i/>
-                <w:iCs/>
                 <w:sz w:val="24"/>
                 <w:szCs w:val="24"/>
               </w:rPr>
@@ -1972,15 +1865,16 @@
               </w:rPr>
               <w:t>aceptar o rechazar la donación de sus órganos o de todo su cuerpo si aún no ha tomado esta decisión por sí mismo. Esto podría incluir la</w:t>
             </w:r>
-          </w:p>
-          <w:p>
-            <w:pPr>
-              <w:rPr>
-                <w:rFonts w:ascii="Verdana" w:eastAsia="Verdana" w:hAnsi="Verdana" w:cs="Verdana"/>
-                <w:sz w:val="24"/>
-                <w:szCs w:val="24"/>
-              </w:rPr>
-            </w:pPr>
+            <w:r>
+              <w:rPr>
+                <w:rFonts w:ascii="Verdana" w:eastAsia="Verdana" w:hAnsi="Verdana" w:cs="Verdana"/>
+                <w:i/>
+                <w:iCs/>
+                <w:sz w:val="24"/>
+                <w:szCs w:val="24"/>
+              </w:rPr>
+              <w:t xml:space="preserve"> </w:t>
+            </w:r>
             <w:r>
               <w:rPr>
                 <w:rFonts w:ascii="Verdana" w:eastAsia="Verdana" w:hAnsi="Verdana" w:cs="Verdana"/>
@@ -4349,15 +4243,6 @@
               <w:t xml:space="preserve">old form to has a copy of the new one, including, but not limited to, your agents and your physicians. </w:t>
             </w:r>
           </w:p>
-          <w:p>
-            <w:pPr>
-              <w:rPr>
-                <w:rFonts w:ascii="Verdana" w:eastAsia="Verdana" w:hAnsi="Verdana" w:cs="Verdana"/>
-                <w:sz w:val="24"/>
-                <w:szCs w:val="24"/>
-              </w:rPr>
-            </w:pPr>
-          </w:p>
         </w:tc>
         <w:tc>
           <w:tcPr>
@@ -4579,24 +4464,7 @@
                 <w:sz w:val="24"/>
                 <w:szCs w:val="24"/>
               </w:rPr>
-              <w:t xml:space="preserve">In the event you do not want to use the Illinois statutory form provided here, any document you complete must be executed by you, designate an agent who is over 18 years of age and not prohibited from serving as your agent, and state the agent's powers, but it need not be witnessed or conform in any other </w:t>
-            </w:r>
-          </w:p>
-          <w:p>
-            <w:pPr>
-              <w:rPr>
-                <w:rFonts w:ascii="Verdana" w:eastAsia="Verdana" w:hAnsi="Verdana" w:cs="Verdana"/>
-                <w:sz w:val="24"/>
-                <w:szCs w:val="24"/>
-              </w:rPr>
-            </w:pPr>
-            <w:r>
-              <w:rPr>
-                <w:rFonts w:ascii="Verdana" w:eastAsia="Verdana" w:hAnsi="Verdana" w:cs="Verdana"/>
-                <w:sz w:val="24"/>
-                <w:szCs w:val="24"/>
-              </w:rPr>
-              <w:t>respect to the statutory health care power.</w:t>
+              <w:t>In the event you do not want to use the Illinois statutory form provided here, any document you complete must be executed by you, designate an agent who is over 18 years of age and not prohibited from serving as your agent, and state the agent's powers, but it need not be witnessed or conform in any other respect to the statutory health care power.</w:t>
             </w:r>
           </w:p>
         </w:tc>
@@ -4614,52 +4482,40 @@
             <w:pPr>
               <w:rPr>
                 <w:rFonts w:ascii="Verdana" w:eastAsia="Verdana" w:hAnsi="Verdana" w:cs="Verdana"/>
-                <w:i/>
-                <w:iCs/>
-                <w:sz w:val="24"/>
-                <w:szCs w:val="24"/>
-              </w:rPr>
-            </w:pPr>
-            <w:r>
-              <w:rPr>
-                <w:rFonts w:ascii="Verdana" w:eastAsia="Verdana" w:hAnsi="Verdana" w:cs="Verdana"/>
-                <w:i/>
-                <w:iCs/>
-                <w:sz w:val="24"/>
-                <w:szCs w:val="24"/>
-              </w:rPr>
-              <w:t xml:space="preserve">En caso de que no desee utilizar el formulario legal de Illinois que se proporciona aquí, cualquier documento que complete debe ser ejecutado por usted, designar a un agente mayor de 18 años y que no tenga prohibido actuar como su </w:t>
-            </w:r>
-          </w:p>
-          <w:p>
-            <w:pPr>
-              <w:rPr>
-                <w:rFonts w:ascii="Verdana" w:eastAsia="Verdana" w:hAnsi="Verdana" w:cs="Verdana"/>
-                <w:i/>
-                <w:iCs/>
-                <w:sz w:val="24"/>
-                <w:szCs w:val="24"/>
-              </w:rPr>
-            </w:pPr>
-            <w:r>
-              <w:rPr>
-                <w:rFonts w:ascii="Verdana" w:eastAsia="Verdana" w:hAnsi="Verdana" w:cs="Verdana"/>
-                <w:i/>
-                <w:iCs/>
-                <w:sz w:val="24"/>
-                <w:szCs w:val="24"/>
-              </w:rPr>
-              <w:t>agente, e indicar los poderes del agente, pero no es necesario</w:t>
-            </w:r>
-          </w:p>
-          <w:p>
-            <w:pPr>
-              <w:rPr>
-                <w:rFonts w:ascii="Verdana" w:eastAsia="Verdana" w:hAnsi="Verdana" w:cs="Verdana"/>
-                <w:sz w:val="24"/>
-                <w:szCs w:val="24"/>
-              </w:rPr>
-            </w:pPr>
+                <w:sz w:val="24"/>
+                <w:szCs w:val="24"/>
+              </w:rPr>
+            </w:pPr>
+            <w:r>
+              <w:rPr>
+                <w:rFonts w:ascii="Verdana" w:eastAsia="Verdana" w:hAnsi="Verdana" w:cs="Verdana"/>
+                <w:i/>
+                <w:iCs/>
+                <w:sz w:val="24"/>
+                <w:szCs w:val="24"/>
+              </w:rPr>
+              <w:t>En caso de que no desee utilizar el formulario legal de Illinois que se proporciona aquí, cualquier documento que complete debe ser ejecutado por usted, designar a un agente mayor de 18 años y que no tenga prohibido actuar como su agente, e indicar los poderes del agente, pero no es necesario</w:t>
+            </w:r>
+            <w:r>
+              <w:rPr>
+                <w:rFonts w:ascii="Verdana" w:eastAsia="Verdana" w:hAnsi="Verdana" w:cs="Verdana"/>
+                <w:i/>
+                <w:iCs/>
+                <w:sz w:val="24"/>
+                <w:szCs w:val="24"/>
+              </w:rPr>
+              <w:t xml:space="preserve"> </w:t>
+            </w:r>
+            <w:r>
+              <w:rPr>
+                <w:rFonts w:ascii="Verdana" w:eastAsia="Verdana" w:hAnsi="Verdana" w:cs="Verdana"/>
+                <w:i/>
+                <w:iCs/>
+                <w:sz w:val="24"/>
+                <w:szCs w:val="24"/>
+              </w:rPr>
+              <w:t xml:space="preserve">que sea atestiguado ni que se ajuste en </w:t>
+            </w:r>
             <w:r>
               <w:rPr>
                 <w:rFonts w:ascii="Verdana" w:eastAsia="Verdana" w:hAnsi="Verdana" w:cs="Verdana"/>
@@ -4669,7 +4525,7 @@
                 <w:szCs w:val="24"/>
               </w:rPr>
               <w:lastRenderedPageBreak/>
-              <w:t>que sea atestiguado ni que se ajuste en ningún otro aspecto al poder legal de atención médica.</w:t>
+              <w:t>ningún otro aspecto al poder legal de atención médica.</w:t>
             </w:r>
           </w:p>
         </w:tc>
@@ -7035,24 +6891,7 @@
                 <w:sz w:val="24"/>
                 <w:szCs w:val="24"/>
               </w:rPr>
-              <w:t xml:space="preserve">The above grant of power is intended to be as broad as possible so that my agent will have the authority to make any decision I could make to obtain or terminate any type of health care, including withdrawal of nutrition and hydration and other life-sustaining </w:t>
-            </w:r>
-          </w:p>
-          <w:p>
-            <w:pPr>
-              <w:rPr>
-                <w:rFonts w:ascii="Verdana" w:eastAsia="Verdana" w:hAnsi="Verdana" w:cs="Verdana"/>
-                <w:sz w:val="24"/>
-                <w:szCs w:val="24"/>
-              </w:rPr>
-            </w:pPr>
-            <w:r>
-              <w:rPr>
-                <w:rFonts w:ascii="Verdana" w:eastAsia="Verdana" w:hAnsi="Verdana" w:cs="Verdana"/>
-                <w:sz w:val="24"/>
-                <w:szCs w:val="24"/>
-              </w:rPr>
-              <w:t>measures.</w:t>
+              <w:t>The above grant of power is intended to be as broad as possible so that my agent will have the authority to make any decision I could make to obtain or terminate any type of health care, including withdrawal of nutrition and hydration and other life-sustaining measures.</w:t>
             </w:r>
           </w:p>
         </w:tc>
@@ -7988,17 +7827,16 @@
               </w:rPr>
               <w:t>Tomar decisiones por mí a partir de ahora y continuar haciéndolo después de que yo ya no sea capaz de tomarlas por mí mismo.</w:t>
             </w:r>
-          </w:p>
-          <w:p>
-            <w:pPr>
-              <w:rPr>
-                <w:rFonts w:ascii="Verdana" w:eastAsia="Verdana" w:hAnsi="Verdana" w:cs="Verdana"/>
-                <w:i/>
-                <w:iCs/>
-                <w:sz w:val="24"/>
-                <w:szCs w:val="24"/>
-              </w:rPr>
-            </w:pPr>
+            <w:r>
+              <w:rPr>
+                <w:rFonts w:ascii="Verdana" w:eastAsia="Verdana" w:hAnsi="Verdana" w:cs="Verdana"/>
+                <w:i/>
+                <w:iCs/>
+                <w:sz w:val="24"/>
+                <w:szCs w:val="24"/>
+              </w:rPr>
+              <w:t xml:space="preserve"> </w:t>
+            </w:r>
             <w:r>
               <w:rPr>
                 <w:rFonts w:ascii="Verdana" w:eastAsia="Verdana" w:hAnsi="Verdana" w:cs="Verdana"/>
@@ -10649,41 +10487,7 @@
                 <w:sz w:val="24"/>
                 <w:szCs w:val="24"/>
               </w:rPr>
-              <w:t xml:space="preserve">You do not need a second witness in Illinois. Other states may not </w:t>
-            </w:r>
-          </w:p>
-          <w:p>
-            <w:pPr>
-              <w:rPr>
-                <w:rFonts w:ascii="Verdana" w:eastAsia="Verdana" w:hAnsi="Verdana" w:cs="Verdana"/>
-                <w:sz w:val="24"/>
-                <w:szCs w:val="24"/>
-              </w:rPr>
-            </w:pPr>
-            <w:r>
-              <w:rPr>
-                <w:rFonts w:ascii="Verdana" w:eastAsia="Verdana" w:hAnsi="Verdana" w:cs="Verdana"/>
-                <w:sz w:val="24"/>
-                <w:szCs w:val="24"/>
-              </w:rPr>
-              <w:t xml:space="preserve">recognize Power of Attorney forms with only one witness. If you want </w:t>
-            </w:r>
-          </w:p>
-          <w:p>
-            <w:pPr>
-              <w:rPr>
-                <w:rFonts w:ascii="Verdana" w:eastAsia="Verdana" w:hAnsi="Verdana" w:cs="Verdana"/>
-                <w:sz w:val="24"/>
-                <w:szCs w:val="24"/>
-              </w:rPr>
-            </w:pPr>
-            <w:r>
-              <w:rPr>
-                <w:rFonts w:ascii="Verdana" w:eastAsia="Verdana" w:hAnsi="Verdana" w:cs="Verdana"/>
-                <w:sz w:val="24"/>
-                <w:szCs w:val="24"/>
-              </w:rPr>
-              <w:t xml:space="preserve">to use this in another state, you may want to have a second witness included. Your POA will still be accepted Illinois if you have two witnesses to your signature. </w:t>
+              <w:t xml:space="preserve">You do not need a second witness in Illinois. Other states may not recognize Power of Attorney forms with only one witness. If you want to use this in another state, you may want to have a second witness included. Your POA will still be accepted Illinois if you have two witnesses to your signature. </w:t>
             </w:r>
           </w:p>
         </w:tc>

</xml_diff>